<commit_message>
Confirm #E4572E as brand accent (v0.2)
Add accent_text #C4421D for small text on white (WCAG AA) and a contrast
rule; drop provisional markers; rebuild Slides and Docs templates.

Co-Authored-By: Claude Opus 5.5 <noreply@anthropic.com>
Claude-Session: https://claude.ai/code/session_01XqgwAyFKTF32FKpGUD9hrF
</commit_message>
<xml_diff>
--- a/brand/templates/brand-docs-template.docx
+++ b/brand/templates/brand-docs-template.docx
@@ -7,7 +7,7 @@
         <w:pStyle w:val="Title"/>
       </w:pPr>
       <w:r>
-        <w:t>Brand Style Guide — v0.1 (draft)</w:t>
+        <w:t>Brand Style Guide — v0.2 (draft)</w:t>
       </w:r>
     </w:p>
     <w:p>
@@ -1339,6 +1339,85 @@
               <w:rPr>
                 <w:sz w:val="19"/>
               </w:rPr>
+              <w:t>Heading 3</w:t>
+            </w:r>
+          </w:p>
+        </w:tc>
+        <w:tc>
+          <w:tcPr>
+            <w:tcW w:type="dxa" w:w="2353"/>
+          </w:tcPr>
+          <w:p>
+            <w:pPr>
+              <w:spacing w:after="0"/>
+            </w:pPr>
+            <w:r>
+              <w:rPr>
+                <w:sz w:val="19"/>
+              </w:rPr>
+              <w:t xml:space="preserve">Jost, </w:t>
+            </w:r>
+            <w:r>
+              <w:rPr>
+                <w:color w:val="C4421D"/>
+                <w:sz w:val="19"/>
+              </w:rPr>
+              <w:t>accent_text</w:t>
+            </w:r>
+            <w:r>
+              <w:rPr>
+                <w:sz w:val="19"/>
+              </w:rPr>
+              <w:t xml:space="preserve"> colour</w:t>
+            </w:r>
+          </w:p>
+        </w:tc>
+        <w:tc>
+          <w:tcPr>
+            <w:tcW w:type="dxa" w:w="2353"/>
+          </w:tcPr>
+          <w:p>
+            <w:pPr>
+              <w:spacing w:after="0"/>
+            </w:pPr>
+            <w:r>
+              <w:rPr>
+                <w:sz w:val="19"/>
+              </w:rPr>
+              <w:t>Bold</w:t>
+            </w:r>
+          </w:p>
+        </w:tc>
+        <w:tc>
+          <w:tcPr>
+            <w:tcW w:type="dxa" w:w="2353"/>
+          </w:tcPr>
+          <w:p>
+            <w:pPr>
+              <w:spacing w:after="0"/>
+            </w:pPr>
+            <w:r>
+              <w:rPr>
+                <w:sz w:val="19"/>
+              </w:rPr>
+              <w:t>11 pt</w:t>
+            </w:r>
+          </w:p>
+        </w:tc>
+      </w:tr>
+      <w:tr>
+        <w:tc>
+          <w:tcPr>
+            <w:tcW w:type="dxa" w:w="2353"/>
+          </w:tcPr>
+          <w:p>
+            <w:pPr>
+              <w:spacing w:after="0"/>
+            </w:pPr>
+            <w:r>
+              <w:rPr>
+                <w:sz w:val="19"/>
+              </w:rPr>
               <w:t>Normal text</w:t>
             </w:r>
           </w:p>
@@ -1465,7 +1544,7 @@
         <w:pStyle w:val="Heading1"/>
       </w:pPr>
       <w:r>
-        <w:t>2. Colour — draft</w:t>
+        <w:t>2. Colour</w:t>
       </w:r>
     </w:p>
     <w:p>
@@ -1479,25 +1558,7 @@
         <w:t>one</w:t>
       </w:r>
       <w:r>
-        <w:t xml:space="preserve"> accent. The accent is </w:t>
-      </w:r>
-      <w:r>
-        <w:rPr>
-          <w:i/>
-        </w:rPr>
-        <w:t>provisional</w:t>
-      </w:r>
-      <w:r>
-        <w:t xml:space="preserve"> until a brand colour is chosen. Changing it means updating </w:t>
-      </w:r>
-      <w:r>
-        <w:rPr>
-          <w:color w:val="E4572E"/>
-        </w:rPr>
-        <w:t>tokens.json</w:t>
-      </w:r>
-      <w:r>
-        <w:t xml:space="preserve"> and the theme colours of the templates.</w:t>
+        <w:t xml:space="preserve"> accent: a warm vermilion that echoes the geometric, Bauhaus-era roots of Futura. Use it sparingly — roughly 10 % of any page or slide.</w:t>
       </w:r>
     </w:p>
     <w:tbl>
@@ -1579,7 +1640,7 @@
             </w:pPr>
             <w:r>
               <w:rPr>
-                <w:color w:val="E4572E"/>
+                <w:color w:val="C4421D"/>
                 <w:sz w:val="19"/>
               </w:rPr>
               <w:t>ink</w:t>
@@ -1596,7 +1657,7 @@
             </w:pPr>
             <w:r>
               <w:rPr>
-                <w:color w:val="E4572E"/>
+                <w:color w:val="C4421D"/>
                 <w:sz w:val="19"/>
               </w:rPr>
               <w:t>#1A1A1A</w:t>
@@ -1631,7 +1692,7 @@
             </w:pPr>
             <w:r>
               <w:rPr>
-                <w:color w:val="E4572E"/>
+                <w:color w:val="C4421D"/>
                 <w:sz w:val="19"/>
               </w:rPr>
               <w:t>paper</w:t>
@@ -1648,7 +1709,7 @@
             </w:pPr>
             <w:r>
               <w:rPr>
-                <w:color w:val="E4572E"/>
+                <w:color w:val="C4421D"/>
                 <w:sz w:val="19"/>
               </w:rPr>
               <w:t>#FFFFFF</w:t>
@@ -1683,7 +1744,7 @@
             </w:pPr>
             <w:r>
               <w:rPr>
-                <w:color w:val="E4572E"/>
+                <w:color w:val="C4421D"/>
                 <w:sz w:val="19"/>
               </w:rPr>
               <w:t>muted</w:t>
@@ -1700,7 +1761,7 @@
             </w:pPr>
             <w:r>
               <w:rPr>
-                <w:color w:val="E4572E"/>
+                <w:color w:val="C4421D"/>
                 <w:sz w:val="19"/>
               </w:rPr>
               <w:t>#6B6B6B</w:t>
@@ -1735,7 +1796,7 @@
             </w:pPr>
             <w:r>
               <w:rPr>
-                <w:color w:val="E4572E"/>
+                <w:color w:val="C4421D"/>
                 <w:sz w:val="19"/>
               </w:rPr>
               <w:t>line</w:t>
@@ -1752,7 +1813,7 @@
             </w:pPr>
             <w:r>
               <w:rPr>
-                <w:color w:val="E4572E"/>
+                <w:color w:val="C4421D"/>
                 <w:sz w:val="19"/>
               </w:rPr>
               <w:t>#E3E3E3</w:t>
@@ -1787,7 +1848,7 @@
             </w:pPr>
             <w:r>
               <w:rPr>
-                <w:color w:val="E4572E"/>
+                <w:color w:val="C4421D"/>
                 <w:sz w:val="19"/>
               </w:rPr>
               <w:t>accent</w:t>
@@ -1804,23 +1865,10 @@
             </w:pPr>
             <w:r>
               <w:rPr>
-                <w:color w:val="E4572E"/>
+                <w:color w:val="C4421D"/>
                 <w:sz w:val="19"/>
               </w:rPr>
               <w:t>#E4572E</w:t>
-            </w:r>
-            <w:r>
-              <w:rPr>
-                <w:sz w:val="19"/>
-              </w:rPr>
-              <w:t xml:space="preserve"> </w:t>
-            </w:r>
-            <w:r>
-              <w:rPr>
-                <w:i/>
-                <w:sz w:val="19"/>
-              </w:rPr>
-              <w:t>(provisional)</w:t>
             </w:r>
           </w:p>
         </w:tc>
@@ -1836,13 +1884,121 @@
               <w:rPr>
                 <w:sz w:val="19"/>
               </w:rPr>
-              <w:t>Title-slide mark, section slides, key numbers, the one highlighted diagram element</w:t>
+              <w:t>Brand colour: title-slide mark, section slides, big numbers, the one highlighted diagram element</w:t>
+            </w:r>
+          </w:p>
+        </w:tc>
+      </w:tr>
+      <w:tr>
+        <w:tc>
+          <w:tcPr>
+            <w:tcW w:type="dxa" w:w="3137"/>
+          </w:tcPr>
+          <w:p>
+            <w:pPr>
+              <w:spacing w:after="0"/>
+            </w:pPr>
+            <w:r>
+              <w:rPr>
+                <w:color w:val="C4421D"/>
+                <w:sz w:val="19"/>
+              </w:rPr>
+              <w:t>accent_text</w:t>
+            </w:r>
+          </w:p>
+        </w:tc>
+        <w:tc>
+          <w:tcPr>
+            <w:tcW w:type="dxa" w:w="3137"/>
+          </w:tcPr>
+          <w:p>
+            <w:pPr>
+              <w:spacing w:after="0"/>
+            </w:pPr>
+            <w:r>
+              <w:rPr>
+                <w:color w:val="C4421D"/>
+                <w:sz w:val="19"/>
+              </w:rPr>
+              <w:t>#C4421D</w:t>
+            </w:r>
+          </w:p>
+        </w:tc>
+        <w:tc>
+          <w:tcPr>
+            <w:tcW w:type="dxa" w:w="3137"/>
+          </w:tcPr>
+          <w:p>
+            <w:pPr>
+              <w:spacing w:after="0"/>
+            </w:pPr>
+            <w:r>
+              <w:rPr>
+                <w:sz w:val="19"/>
+              </w:rPr>
+              <w:t>Small accent text on white (labels, links, doc sub-headings)</w:t>
             </w:r>
           </w:p>
         </w:tc>
       </w:tr>
     </w:tbl>
     <w:p/>
+    <w:p>
+      <w:r>
+        <w:rPr>
+          <w:b/>
+        </w:rPr>
+        <w:t>Contrast rule.</w:t>
+      </w:r>
+      <w:r>
+        <w:t xml:space="preserve"> </w:t>
+      </w:r>
+      <w:r>
+        <w:rPr>
+          <w:color w:val="C4421D"/>
+        </w:rPr>
+        <w:t>accent</w:t>
+      </w:r>
+      <w:r>
+        <w:t xml:space="preserve"> on white is 3.7 : 1 — fine for shapes and large text (≥ 18 pt bold or ≥ 24 pt), too light for small text. For anything smaller use </w:t>
+      </w:r>
+      <w:r>
+        <w:rPr>
+          <w:color w:val="C4421D"/>
+        </w:rPr>
+        <w:t>accent_text</w:t>
+      </w:r>
+      <w:r>
+        <w:t xml:space="preserve"> (5.1 : 1, meets WCAG AA). White text on an </w:t>
+      </w:r>
+      <w:r>
+        <w:rPr>
+          <w:color w:val="C4421D"/>
+        </w:rPr>
+        <w:t>accent</w:t>
+      </w:r>
+      <w:r>
+        <w:t xml:space="preserve"> background only at ≥ 18 pt bold; </w:t>
+      </w:r>
+      <w:r>
+        <w:rPr>
+          <w:color w:val="C4421D"/>
+        </w:rPr>
+        <w:t>ink</w:t>
+      </w:r>
+      <w:r>
+        <w:t xml:space="preserve"> on </w:t>
+      </w:r>
+      <w:r>
+        <w:rPr>
+          <w:color w:val="C4421D"/>
+        </w:rPr>
+        <w:t>accent</w:t>
+      </w:r>
+      <w:r>
+        <w:t xml:space="preserve"> works at any size (4.7 : 1).</w:t>
+      </w:r>
+    </w:p>
     <w:p>
       <w:pPr>
         <w:pStyle w:val="Heading1"/>
@@ -1907,7 +2063,7 @@
       </w:r>
       <w:r>
         <w:rPr>
-          <w:color w:val="E4572E"/>
+          <w:color w:val="C4421D"/>
         </w:rPr>
         <w:t>line</w:t>
       </w:r>
@@ -2016,7 +2172,34 @@
         <w:t>Theme colours</w:t>
       </w:r>
       <w:r>
-        <w:t xml:space="preserve"> → enter the palette above.</w:t>
+        <w:t xml:space="preserve"> → Accent 1 </w:t>
+      </w:r>
+      <w:r>
+        <w:rPr>
+          <w:color w:val="C4421D"/>
+        </w:rPr>
+        <w:t>#E4572E</w:t>
+      </w:r>
+      <w:r>
+        <w:t xml:space="preserve">, Dark 1 </w:t>
+      </w:r>
+      <w:r>
+        <w:rPr>
+          <w:color w:val="C4421D"/>
+        </w:rPr>
+        <w:t>#1A1A1A</w:t>
+      </w:r>
+      <w:r>
+        <w:t xml:space="preserve">, Light 1 </w:t>
+      </w:r>
+      <w:r>
+        <w:rPr>
+          <w:color w:val="C4421D"/>
+        </w:rPr>
+        <w:t>#FFFFFF</w:t>
+      </w:r>
+      <w:r>
+        <w:t>.</w:t>
       </w:r>
     </w:p>
     <w:p>
@@ -2027,11 +2210,11 @@
       <w:r>
         <w:t>5.</w:t>
         <w:tab/>
-        <w:t xml:space="preserve">Rename the theme (e.g. "Brand v0.1"), save the file as </w:t>
+        <w:t xml:space="preserve">Rename the theme (e.g. "Brand v0.2"), save the file as </w:t>
       </w:r>
       <w:r>
         <w:rPr>
-          <w:color w:val="E4572E"/>
+          <w:color w:val="C4421D"/>
         </w:rPr>
         <w:t>TEMPLATE – Slides</w:t>
       </w:r>
@@ -2214,7 +2397,7 @@
             </w:pPr>
             <w:r>
               <w:rPr>
-                <w:color w:val="E4572E"/>
+                <w:color w:val="C4421D"/>
                 <w:sz w:val="19"/>
               </w:rPr>
               <w:t>templates/brand-slides-template.pptx</w:t>
@@ -2249,7 +2432,7 @@
             </w:pPr>
             <w:r>
               <w:rPr>
-                <w:color w:val="E4572E"/>
+                <w:color w:val="C4421D"/>
                 <w:sz w:val="19"/>
               </w:rPr>
               <w:t>templates/brand-docs-template.docx</w:t>
@@ -2284,7 +2467,7 @@
             </w:pPr>
             <w:r>
               <w:rPr>
-                <w:color w:val="E4572E"/>
+                <w:color w:val="C4421D"/>
                 <w:sz w:val="19"/>
               </w:rPr>
               <w:t>templates/build_slides.js</w:t>
@@ -2297,7 +2480,7 @@
             </w:r>
             <w:r>
               <w:rPr>
-                <w:color w:val="E4572E"/>
+                <w:color w:val="C4421D"/>
                 <w:sz w:val="19"/>
               </w:rPr>
               <w:t>templates/build_docs.py</w:t>
@@ -2320,7 +2503,7 @@
             </w:r>
             <w:r>
               <w:rPr>
-                <w:color w:val="E4572E"/>
+                <w:color w:val="C4421D"/>
                 <w:sz w:val="19"/>
               </w:rPr>
               <w:t>tokens.json</w:t>
@@ -2355,6 +2538,38 @@
       </w:pPr>
       <w:r>
         <w:t>Changelog</w:t>
+      </w:r>
+    </w:p>
+    <w:p>
+      <w:pPr>
+        <w:pStyle w:val="ListBullet"/>
+      </w:pPr>
+      <w:r>
+        <w:rPr>
+          <w:b/>
+        </w:rPr>
+        <w:t>v0.2</w:t>
+      </w:r>
+      <w:r>
+        <w:t xml:space="preserve"> — Accent </w:t>
+      </w:r>
+      <w:r>
+        <w:rPr>
+          <w:color w:val="C4421D"/>
+        </w:rPr>
+        <w:t>#E4572E</w:t>
+      </w:r>
+      <w:r>
+        <w:t xml:space="preserve"> confirmed as brand colour; added </w:t>
+      </w:r>
+      <w:r>
+        <w:rPr>
+          <w:color w:val="C4421D"/>
+        </w:rPr>
+        <w:t>accent_text</w:t>
+      </w:r>
+      <w:r>
+        <w:t xml:space="preserve"> and contrast rule.</w:t>
       </w:r>
     </w:p>
     <w:p>
@@ -2864,7 +3079,7 @@
       <w:rFonts w:ascii="Jost" w:hAnsi="Jost" w:eastAsia="Jost" w:cs="Jost"/>
       <w:b/>
       <w:bCs/>
-      <w:color w:val="E4572E"/>
+      <w:color w:val="C4421D"/>
       <w:sz w:val="22"/>
     </w:rPr>
   </w:style>

</xml_diff>

<commit_message>
Add workflow that rebuilds brand templates on source changes
Pin build dependencies (package.json/lockfile, requirements.txt) so the
templates rebuild the same way in CI and locally.

Co-Authored-By: Claude Opus 5.5 <noreply@anthropic.com>
Claude-Session: https://claude.ai/code/session_01XqgwAyFKTF32FKpGUD9hrF
</commit_message>
<xml_diff>
--- a/brand/templates/brand-docs-template.docx
+++ b/brand/templates/brand-docs-template.docx
@@ -2512,13 +2512,54 @@
               <w:rPr>
                 <w:sz w:val="19"/>
               </w:rPr>
-              <w:t xml:space="preserve"> after the guide changes</w:t>
+              <w:t xml:space="preserve"> and this guide</w:t>
             </w:r>
           </w:p>
         </w:tc>
       </w:tr>
     </w:tbl>
     <w:p/>
+    <w:p>
+      <w:r>
+        <w:t xml:space="preserve">On GitHub, the </w:t>
+      </w:r>
+      <w:r>
+        <w:rPr>
+          <w:b/>
+        </w:rPr>
+        <w:t>Build brand templates</w:t>
+      </w:r>
+      <w:r>
+        <w:t xml:space="preserve"> workflow reruns both scripts whenever </w:t>
+      </w:r>
+      <w:r>
+        <w:rPr>
+          <w:color w:val="C4421D"/>
+        </w:rPr>
+        <w:t>tokens.json</w:t>
+      </w:r>
+      <w:r>
+        <w:t xml:space="preserve">, this guide or the build scripts change, and commits the fresh templates. Locally: </w:t>
+      </w:r>
+      <w:r>
+        <w:rPr>
+          <w:color w:val="C4421D"/>
+        </w:rPr>
+        <w:t>cd brand/templates &amp;&amp; npm ci &amp;&amp; pip install -r requirements.txt</w:t>
+      </w:r>
+      <w:r>
+        <w:t xml:space="preserve">, then </w:t>
+      </w:r>
+      <w:r>
+        <w:rPr>
+          <w:color w:val="C4421D"/>
+        </w:rPr>
+        <w:t>node build_slides.js &amp;&amp; python3 build_docs.py</w:t>
+      </w:r>
+      <w:r>
+        <w:t>.</w:t>
+      </w:r>
+    </w:p>
     <w:p>
       <w:pPr>
         <w:pStyle w:val="Heading1"/>

</xml_diff>

<commit_message>
Add chart and diagram colour rules (v0.3)
Categorical series led by the accent, a vermilion sequential ramp and a
blue/vermilion diverging pair, all checked for colour-vision separation
in light and dark. Adds a sample chart slide to the Slides template.

Co-Authored-By: Claude Opus 5.5 <noreply@anthropic.com>
Claude-Session: https://claude.ai/code/session_01XqgwAyFKTF32FKpGUD9hrF
</commit_message>
<xml_diff>
--- a/brand/templates/brand-docs-template.docx
+++ b/brand/templates/brand-docs-template.docx
@@ -7,7 +7,7 @@
         <w:pStyle w:val="Title"/>
       </w:pPr>
       <w:r>
-        <w:t>Brand Style Guide — v0.2 (draft)</w:t>
+        <w:t>Brand Style Guide — v0.3 (draft)</w:t>
       </w:r>
     </w:p>
     <w:p>
@@ -2004,7 +2004,1066 @@
         <w:pStyle w:val="Heading1"/>
       </w:pPr>
       <w:r>
-        <w:t>3. Layout principles (starting set)</w:t>
+        <w:t>3. Charts &amp; diagrams</w:t>
+      </w:r>
+    </w:p>
+    <w:p>
+      <w:r>
+        <w:t>Charts use the same two typefaces and the same accent. Colours below were checked with a colour-vision-deficiency validator (adjacent series stay distinguishable for the common forms of colour blindness), in light and dark.</w:t>
+      </w:r>
+    </w:p>
+    <w:p>
+      <w:pPr>
+        <w:pStyle w:val="Heading2"/>
+      </w:pPr>
+      <w:r>
+        <w:t>Highlight first, palette second</w:t>
+      </w:r>
+    </w:p>
+    <w:p>
+      <w:r>
+        <w:t xml:space="preserve">Most charts should be </w:t>
+      </w:r>
+      <w:r>
+        <w:rPr>
+          <w:b/>
+        </w:rPr>
+        <w:t>grey plus one accent</w:t>
+      </w:r>
+      <w:r>
+        <w:t xml:space="preserve">: the series or bar you are talking about in </w:t>
+      </w:r>
+      <w:r>
+        <w:rPr>
+          <w:color w:val="C4421D"/>
+        </w:rPr>
+        <w:t>accent</w:t>
+      </w:r>
+      <w:r>
+        <w:t xml:space="preserve">, everything else in </w:t>
+      </w:r>
+      <w:r>
+        <w:rPr>
+          <w:color w:val="C4421D"/>
+        </w:rPr>
+        <w:t>neutral_series</w:t>
+      </w:r>
+      <w:r>
+        <w:t xml:space="preserve"> </w:t>
+      </w:r>
+      <w:r>
+        <w:rPr>
+          <w:color w:val="C4421D"/>
+        </w:rPr>
+        <w:t>#BDBDBD</w:t>
+      </w:r>
+      <w:r>
+        <w:t>. Reach for the full palette only when several series really need their own identity.</w:t>
+      </w:r>
+    </w:p>
+    <w:p>
+      <w:pPr>
+        <w:pStyle w:val="Heading2"/>
+      </w:pPr>
+      <w:r>
+        <w:t>Series colours (categorical)</w:t>
+      </w:r>
+    </w:p>
+    <w:p>
+      <w:r>
+        <w:t>Always assign in this order, never skip or shuffle. Slot 1 is the brand accent.</w:t>
+      </w:r>
+    </w:p>
+    <w:tbl>
+      <w:tblPr>
+        <w:tblStyle w:val="TableGrid"/>
+        <w:tblW w:type="auto" w:w="0"/>
+        <w:jc w:val="left"/>
+        <w:tblLook w:firstColumn="1" w:firstRow="1" w:lastColumn="0" w:lastRow="0" w:noHBand="0" w:noVBand="1" w:val="04A0"/>
+      </w:tblPr>
+      <w:tblGrid>
+        <w:gridCol w:w="2353"/>
+        <w:gridCol w:w="2353"/>
+        <w:gridCol w:w="2353"/>
+        <w:gridCol w:w="2353"/>
+      </w:tblGrid>
+      <w:tr>
+        <w:tc>
+          <w:tcPr>
+            <w:tcW w:type="dxa" w:w="2353"/>
+            <w:shd w:val="clear" w:color="auto" w:fill="F4F4F4"/>
+          </w:tcPr>
+          <w:p>
+            <w:pPr>
+              <w:spacing w:after="0"/>
+            </w:pPr>
+            <w:r>
+              <w:rPr>
+                <w:b/>
+                <w:sz w:val="19"/>
+              </w:rPr>
+              <w:t>Slot</w:t>
+            </w:r>
+          </w:p>
+        </w:tc>
+        <w:tc>
+          <w:tcPr>
+            <w:tcW w:type="dxa" w:w="2353"/>
+            <w:shd w:val="clear" w:color="auto" w:fill="F4F4F4"/>
+          </w:tcPr>
+          <w:p>
+            <w:pPr>
+              <w:spacing w:after="0"/>
+            </w:pPr>
+            <w:r>
+              <w:rPr>
+                <w:b/>
+                <w:sz w:val="19"/>
+              </w:rPr>
+              <w:t>Light</w:t>
+            </w:r>
+          </w:p>
+        </w:tc>
+        <w:tc>
+          <w:tcPr>
+            <w:tcW w:type="dxa" w:w="2353"/>
+            <w:shd w:val="clear" w:color="auto" w:fill="F4F4F4"/>
+          </w:tcPr>
+          <w:p>
+            <w:pPr>
+              <w:spacing w:after="0"/>
+            </w:pPr>
+            <w:r>
+              <w:rPr>
+                <w:b/>
+                <w:sz w:val="19"/>
+              </w:rPr>
+              <w:t>Dark</w:t>
+            </w:r>
+          </w:p>
+        </w:tc>
+        <w:tc>
+          <w:tcPr>
+            <w:tcW w:type="dxa" w:w="2353"/>
+            <w:shd w:val="clear" w:color="auto" w:fill="F4F4F4"/>
+          </w:tcPr>
+          <w:p>
+            <w:pPr>
+              <w:spacing w:after="0"/>
+            </w:pPr>
+            <w:r>
+              <w:rPr>
+                <w:b/>
+                <w:sz w:val="19"/>
+              </w:rPr>
+              <w:t>Hue</w:t>
+            </w:r>
+          </w:p>
+        </w:tc>
+      </w:tr>
+      <w:tr>
+        <w:tc>
+          <w:tcPr>
+            <w:tcW w:type="dxa" w:w="2353"/>
+          </w:tcPr>
+          <w:p>
+            <w:pPr>
+              <w:spacing w:after="0"/>
+            </w:pPr>
+            <w:r>
+              <w:rPr>
+                <w:sz w:val="19"/>
+              </w:rPr>
+              <w:t>1</w:t>
+            </w:r>
+          </w:p>
+        </w:tc>
+        <w:tc>
+          <w:tcPr>
+            <w:tcW w:type="dxa" w:w="2353"/>
+          </w:tcPr>
+          <w:p>
+            <w:pPr>
+              <w:spacing w:after="0"/>
+            </w:pPr>
+            <w:r>
+              <w:rPr>
+                <w:color w:val="C4421D"/>
+                <w:sz w:val="19"/>
+              </w:rPr>
+              <w:t>#E4572E</w:t>
+            </w:r>
+          </w:p>
+        </w:tc>
+        <w:tc>
+          <w:tcPr>
+            <w:tcW w:type="dxa" w:w="2353"/>
+          </w:tcPr>
+          <w:p>
+            <w:pPr>
+              <w:spacing w:after="0"/>
+            </w:pPr>
+            <w:r>
+              <w:rPr>
+                <w:color w:val="C4421D"/>
+                <w:sz w:val="19"/>
+              </w:rPr>
+              <w:t>#E4572E</w:t>
+            </w:r>
+          </w:p>
+        </w:tc>
+        <w:tc>
+          <w:tcPr>
+            <w:tcW w:type="dxa" w:w="2353"/>
+          </w:tcPr>
+          <w:p>
+            <w:pPr>
+              <w:spacing w:after="0"/>
+            </w:pPr>
+            <w:r>
+              <w:rPr>
+                <w:sz w:val="19"/>
+              </w:rPr>
+              <w:t>vermilion (accent)</w:t>
+            </w:r>
+          </w:p>
+        </w:tc>
+      </w:tr>
+      <w:tr>
+        <w:tc>
+          <w:tcPr>
+            <w:tcW w:type="dxa" w:w="2353"/>
+          </w:tcPr>
+          <w:p>
+            <w:pPr>
+              <w:spacing w:after="0"/>
+            </w:pPr>
+            <w:r>
+              <w:rPr>
+                <w:sz w:val="19"/>
+              </w:rPr>
+              <w:t>2</w:t>
+            </w:r>
+          </w:p>
+        </w:tc>
+        <w:tc>
+          <w:tcPr>
+            <w:tcW w:type="dxa" w:w="2353"/>
+          </w:tcPr>
+          <w:p>
+            <w:pPr>
+              <w:spacing w:after="0"/>
+            </w:pPr>
+            <w:r>
+              <w:rPr>
+                <w:color w:val="C4421D"/>
+                <w:sz w:val="19"/>
+              </w:rPr>
+              <w:t>#2A78D6</w:t>
+            </w:r>
+          </w:p>
+        </w:tc>
+        <w:tc>
+          <w:tcPr>
+            <w:tcW w:type="dxa" w:w="2353"/>
+          </w:tcPr>
+          <w:p>
+            <w:pPr>
+              <w:spacing w:after="0"/>
+            </w:pPr>
+            <w:r>
+              <w:rPr>
+                <w:color w:val="C4421D"/>
+                <w:sz w:val="19"/>
+              </w:rPr>
+              <w:t>#3987E5</w:t>
+            </w:r>
+          </w:p>
+        </w:tc>
+        <w:tc>
+          <w:tcPr>
+            <w:tcW w:type="dxa" w:w="2353"/>
+          </w:tcPr>
+          <w:p>
+            <w:pPr>
+              <w:spacing w:after="0"/>
+            </w:pPr>
+            <w:r>
+              <w:rPr>
+                <w:sz w:val="19"/>
+              </w:rPr>
+              <w:t>blue</w:t>
+            </w:r>
+          </w:p>
+        </w:tc>
+      </w:tr>
+      <w:tr>
+        <w:tc>
+          <w:tcPr>
+            <w:tcW w:type="dxa" w:w="2353"/>
+          </w:tcPr>
+          <w:p>
+            <w:pPr>
+              <w:spacing w:after="0"/>
+            </w:pPr>
+            <w:r>
+              <w:rPr>
+                <w:sz w:val="19"/>
+              </w:rPr>
+              <w:t>3</w:t>
+            </w:r>
+          </w:p>
+        </w:tc>
+        <w:tc>
+          <w:tcPr>
+            <w:tcW w:type="dxa" w:w="2353"/>
+          </w:tcPr>
+          <w:p>
+            <w:pPr>
+              <w:spacing w:after="0"/>
+            </w:pPr>
+            <w:r>
+              <w:rPr>
+                <w:color w:val="C4421D"/>
+                <w:sz w:val="19"/>
+              </w:rPr>
+              <w:t>#1BAF7A</w:t>
+            </w:r>
+          </w:p>
+        </w:tc>
+        <w:tc>
+          <w:tcPr>
+            <w:tcW w:type="dxa" w:w="2353"/>
+          </w:tcPr>
+          <w:p>
+            <w:pPr>
+              <w:spacing w:after="0"/>
+            </w:pPr>
+            <w:r>
+              <w:rPr>
+                <w:color w:val="C4421D"/>
+                <w:sz w:val="19"/>
+              </w:rPr>
+              <w:t>#199E70</w:t>
+            </w:r>
+          </w:p>
+        </w:tc>
+        <w:tc>
+          <w:tcPr>
+            <w:tcW w:type="dxa" w:w="2353"/>
+          </w:tcPr>
+          <w:p>
+            <w:pPr>
+              <w:spacing w:after="0"/>
+            </w:pPr>
+            <w:r>
+              <w:rPr>
+                <w:sz w:val="19"/>
+              </w:rPr>
+              <w:t>aqua</w:t>
+            </w:r>
+          </w:p>
+        </w:tc>
+      </w:tr>
+      <w:tr>
+        <w:tc>
+          <w:tcPr>
+            <w:tcW w:type="dxa" w:w="2353"/>
+          </w:tcPr>
+          <w:p>
+            <w:pPr>
+              <w:spacing w:after="0"/>
+            </w:pPr>
+            <w:r>
+              <w:rPr>
+                <w:sz w:val="19"/>
+              </w:rPr>
+              <w:t>4</w:t>
+            </w:r>
+          </w:p>
+        </w:tc>
+        <w:tc>
+          <w:tcPr>
+            <w:tcW w:type="dxa" w:w="2353"/>
+          </w:tcPr>
+          <w:p>
+            <w:pPr>
+              <w:spacing w:after="0"/>
+            </w:pPr>
+            <w:r>
+              <w:rPr>
+                <w:color w:val="C4421D"/>
+                <w:sz w:val="19"/>
+              </w:rPr>
+              <w:t>#EDA100</w:t>
+            </w:r>
+          </w:p>
+        </w:tc>
+        <w:tc>
+          <w:tcPr>
+            <w:tcW w:type="dxa" w:w="2353"/>
+          </w:tcPr>
+          <w:p>
+            <w:pPr>
+              <w:spacing w:after="0"/>
+            </w:pPr>
+            <w:r>
+              <w:rPr>
+                <w:color w:val="C4421D"/>
+                <w:sz w:val="19"/>
+              </w:rPr>
+              <w:t>#C98500</w:t>
+            </w:r>
+          </w:p>
+        </w:tc>
+        <w:tc>
+          <w:tcPr>
+            <w:tcW w:type="dxa" w:w="2353"/>
+          </w:tcPr>
+          <w:p>
+            <w:pPr>
+              <w:spacing w:after="0"/>
+            </w:pPr>
+            <w:r>
+              <w:rPr>
+                <w:sz w:val="19"/>
+              </w:rPr>
+              <w:t>ochre</w:t>
+            </w:r>
+          </w:p>
+        </w:tc>
+      </w:tr>
+      <w:tr>
+        <w:tc>
+          <w:tcPr>
+            <w:tcW w:type="dxa" w:w="2353"/>
+          </w:tcPr>
+          <w:p>
+            <w:pPr>
+              <w:spacing w:after="0"/>
+            </w:pPr>
+            <w:r>
+              <w:rPr>
+                <w:sz w:val="19"/>
+              </w:rPr>
+              <w:t>5</w:t>
+            </w:r>
+          </w:p>
+        </w:tc>
+        <w:tc>
+          <w:tcPr>
+            <w:tcW w:type="dxa" w:w="2353"/>
+          </w:tcPr>
+          <w:p>
+            <w:pPr>
+              <w:spacing w:after="0"/>
+            </w:pPr>
+            <w:r>
+              <w:rPr>
+                <w:color w:val="C4421D"/>
+                <w:sz w:val="19"/>
+              </w:rPr>
+              <w:t>#4A3AA7</w:t>
+            </w:r>
+          </w:p>
+        </w:tc>
+        <w:tc>
+          <w:tcPr>
+            <w:tcW w:type="dxa" w:w="2353"/>
+          </w:tcPr>
+          <w:p>
+            <w:pPr>
+              <w:spacing w:after="0"/>
+            </w:pPr>
+            <w:r>
+              <w:rPr>
+                <w:color w:val="C4421D"/>
+                <w:sz w:val="19"/>
+              </w:rPr>
+              <w:t>#9085E9</w:t>
+            </w:r>
+          </w:p>
+        </w:tc>
+        <w:tc>
+          <w:tcPr>
+            <w:tcW w:type="dxa" w:w="2353"/>
+          </w:tcPr>
+          <w:p>
+            <w:pPr>
+              <w:spacing w:after="0"/>
+            </w:pPr>
+            <w:r>
+              <w:rPr>
+                <w:sz w:val="19"/>
+              </w:rPr>
+              <w:t>violet</w:t>
+            </w:r>
+          </w:p>
+        </w:tc>
+      </w:tr>
+      <w:tr>
+        <w:tc>
+          <w:tcPr>
+            <w:tcW w:type="dxa" w:w="2353"/>
+          </w:tcPr>
+          <w:p>
+            <w:pPr>
+              <w:spacing w:after="0"/>
+            </w:pPr>
+            <w:r>
+              <w:rPr>
+                <w:sz w:val="19"/>
+              </w:rPr>
+              <w:t>6</w:t>
+            </w:r>
+          </w:p>
+        </w:tc>
+        <w:tc>
+          <w:tcPr>
+            <w:tcW w:type="dxa" w:w="2353"/>
+          </w:tcPr>
+          <w:p>
+            <w:pPr>
+              <w:spacing w:after="0"/>
+            </w:pPr>
+            <w:r>
+              <w:rPr>
+                <w:color w:val="C4421D"/>
+                <w:sz w:val="19"/>
+              </w:rPr>
+              <w:t>#E87BA4</w:t>
+            </w:r>
+          </w:p>
+        </w:tc>
+        <w:tc>
+          <w:tcPr>
+            <w:tcW w:type="dxa" w:w="2353"/>
+          </w:tcPr>
+          <w:p>
+            <w:pPr>
+              <w:spacing w:after="0"/>
+            </w:pPr>
+            <w:r>
+              <w:rPr>
+                <w:color w:val="C4421D"/>
+                <w:sz w:val="19"/>
+              </w:rPr>
+              <w:t>#D55181</w:t>
+            </w:r>
+          </w:p>
+        </w:tc>
+        <w:tc>
+          <w:tcPr>
+            <w:tcW w:type="dxa" w:w="2353"/>
+          </w:tcPr>
+          <w:p>
+            <w:pPr>
+              <w:spacing w:after="0"/>
+            </w:pPr>
+            <w:r>
+              <w:rPr>
+                <w:sz w:val="19"/>
+              </w:rPr>
+              <w:t>pink</w:t>
+            </w:r>
+          </w:p>
+        </w:tc>
+      </w:tr>
+      <w:tr>
+        <w:tc>
+          <w:tcPr>
+            <w:tcW w:type="dxa" w:w="2353"/>
+          </w:tcPr>
+          <w:p>
+            <w:pPr>
+              <w:spacing w:after="0"/>
+            </w:pPr>
+            <w:r>
+              <w:rPr>
+                <w:sz w:val="19"/>
+              </w:rPr>
+              <w:t>7</w:t>
+            </w:r>
+          </w:p>
+        </w:tc>
+        <w:tc>
+          <w:tcPr>
+            <w:tcW w:type="dxa" w:w="2353"/>
+          </w:tcPr>
+          <w:p>
+            <w:pPr>
+              <w:spacing w:after="0"/>
+            </w:pPr>
+            <w:r>
+              <w:rPr>
+                <w:color w:val="C4421D"/>
+                <w:sz w:val="19"/>
+              </w:rPr>
+              <w:t>#008300</w:t>
+            </w:r>
+          </w:p>
+        </w:tc>
+        <w:tc>
+          <w:tcPr>
+            <w:tcW w:type="dxa" w:w="2353"/>
+          </w:tcPr>
+          <w:p>
+            <w:pPr>
+              <w:spacing w:after="0"/>
+            </w:pPr>
+            <w:r>
+              <w:rPr>
+                <w:color w:val="C4421D"/>
+                <w:sz w:val="19"/>
+              </w:rPr>
+              <w:t>#008300</w:t>
+            </w:r>
+          </w:p>
+        </w:tc>
+        <w:tc>
+          <w:tcPr>
+            <w:tcW w:type="dxa" w:w="2353"/>
+          </w:tcPr>
+          <w:p>
+            <w:pPr>
+              <w:spacing w:after="0"/>
+            </w:pPr>
+            <w:r>
+              <w:rPr>
+                <w:sz w:val="19"/>
+              </w:rPr>
+              <w:t>green</w:t>
+            </w:r>
+          </w:p>
+        </w:tc>
+      </w:tr>
+    </w:tbl>
+    <w:p/>
+    <w:p>
+      <w:pPr>
+        <w:pStyle w:val="ListBullet"/>
+      </w:pPr>
+      <w:r>
+        <w:rPr>
+          <w:b/>
+        </w:rPr>
+        <w:t>Lines, bars, stacks:</w:t>
+      </w:r>
+      <w:r>
+        <w:t xml:space="preserve"> up to 7 series. More than 7 → group the rest as "Other" or split into small charts.</w:t>
+      </w:r>
+    </w:p>
+    <w:p>
+      <w:pPr>
+        <w:pStyle w:val="ListBullet"/>
+      </w:pPr>
+      <w:r>
+        <w:rPr>
+          <w:b/>
+        </w:rPr>
+        <w:t>Scatter plots, maps, anything where every colour sits next to every other:</w:t>
+      </w:r>
+      <w:r>
+        <w:t xml:space="preserve"> max </w:t>
+      </w:r>
+      <w:r>
+        <w:rPr>
+          <w:b/>
+        </w:rPr>
+        <w:t>3</w:t>
+      </w:r>
+      <w:r>
+        <w:t xml:space="preserve"> series (slot 4 ochre is too close to the vermilion accent there).</w:t>
+      </w:r>
+    </w:p>
+    <w:p>
+      <w:pPr>
+        <w:pStyle w:val="ListBullet"/>
+      </w:pPr>
+      <w:r>
+        <w:t>Slots 3, 4 and 6 are light on white: label those series directly or add a table.</w:t>
+      </w:r>
+    </w:p>
+    <w:p>
+      <w:pPr>
+        <w:pStyle w:val="ListBullet"/>
+      </w:pPr>
+      <w:r>
+        <w:t>A series keeps its colour when filters change; colour follows the thing, not its rank.</w:t>
+      </w:r>
+    </w:p>
+    <w:p>
+      <w:pPr>
+        <w:pStyle w:val="Heading2"/>
+      </w:pPr>
+      <w:r>
+        <w:t>Magnitude (sequential) and above/below (diverging)</w:t>
+      </w:r>
+    </w:p>
+    <w:p>
+      <w:pPr>
+        <w:pStyle w:val="ListBullet"/>
+      </w:pPr>
+      <w:r>
+        <w:rPr>
+          <w:b/>
+        </w:rPr>
+        <w:t>Sequential</w:t>
+      </w:r>
+      <w:r>
+        <w:t xml:space="preserve"> (heatmaps, "how much"): one hue, vermilion from light to dark: </w:t>
+      </w:r>
+      <w:r>
+        <w:rPr>
+          <w:color w:val="C4421D"/>
+        </w:rPr>
+        <w:t>#FBE3DA</w:t>
+      </w:r>
+      <w:r>
+        <w:t xml:space="preserve"> </w:t>
+      </w:r>
+      <w:r>
+        <w:rPr>
+          <w:color w:val="C4421D"/>
+        </w:rPr>
+        <w:t>#F6C3B1</w:t>
+      </w:r>
+      <w:r>
+        <w:t xml:space="preserve"> </w:t>
+      </w:r>
+      <w:r>
+        <w:rPr>
+          <w:color w:val="C4421D"/>
+        </w:rPr>
+        <w:t>#F0A084</w:t>
+      </w:r>
+      <w:r>
+        <w:t xml:space="preserve"> </w:t>
+      </w:r>
+      <w:r>
+        <w:rPr>
+          <w:color w:val="C4421D"/>
+        </w:rPr>
+        <w:t>#EA7B55</w:t>
+      </w:r>
+      <w:r>
+        <w:t xml:space="preserve"> </w:t>
+      </w:r>
+      <w:r>
+        <w:rPr>
+          <w:color w:val="C4421D"/>
+        </w:rPr>
+        <w:t>#E4572E</w:t>
+      </w:r>
+      <w:r>
+        <w:t xml:space="preserve"> </w:t>
+      </w:r>
+      <w:r>
+        <w:rPr>
+          <w:color w:val="C4421D"/>
+        </w:rPr>
+        <w:t>#C4421D</w:t>
+      </w:r>
+      <w:r>
+        <w:t xml:space="preserve"> </w:t>
+      </w:r>
+      <w:r>
+        <w:rPr>
+          <w:color w:val="C4421D"/>
+        </w:rPr>
+        <w:t>#9C3417</w:t>
+      </w:r>
+      <w:r>
+        <w:t xml:space="preserve"> </w:t>
+      </w:r>
+      <w:r>
+        <w:rPr>
+          <w:color w:val="C4421D"/>
+        </w:rPr>
+        <w:t>#742712</w:t>
+      </w:r>
+      <w:r>
+        <w:t xml:space="preserve">. For discrete ordered steps (tiers, funnel stages) start at </w:t>
+      </w:r>
+      <w:r>
+        <w:rPr>
+          <w:color w:val="C4421D"/>
+        </w:rPr>
+        <w:t>#F0A084</w:t>
+      </w:r>
+      <w:r>
+        <w:t xml:space="preserve"> or darker.</w:t>
+      </w:r>
+    </w:p>
+    <w:p>
+      <w:pPr>
+        <w:pStyle w:val="ListBullet"/>
+      </w:pPr>
+      <w:r>
+        <w:rPr>
+          <w:b/>
+        </w:rPr>
+        <w:t>Diverging</w:t>
+      </w:r>
+      <w:r>
+        <w:t xml:space="preserve"> (above/below target, gain/loss): blue ← grey </w:t>
+      </w:r>
+      <w:r>
+        <w:rPr>
+          <w:color w:val="C4421D"/>
+        </w:rPr>
+        <w:t>#EFEFEF</w:t>
+      </w:r>
+      <w:r>
+        <w:t xml:space="preserve"> → vermilion. Blue arm </w:t>
+      </w:r>
+      <w:r>
+        <w:rPr>
+          <w:color w:val="C4421D"/>
+        </w:rPr>
+        <w:t>#1F5FAD</w:t>
+      </w:r>
+      <w:r>
+        <w:t xml:space="preserve"> </w:t>
+      </w:r>
+      <w:r>
+        <w:rPr>
+          <w:color w:val="C4421D"/>
+        </w:rPr>
+        <w:t>#2A78D6</w:t>
+      </w:r>
+      <w:r>
+        <w:t xml:space="preserve"> </w:t>
+      </w:r>
+      <w:r>
+        <w:rPr>
+          <w:color w:val="C4421D"/>
+        </w:rPr>
+        <w:t>#86B3EA</w:t>
+      </w:r>
+      <w:r>
+        <w:t xml:space="preserve"> </w:t>
+      </w:r>
+      <w:r>
+        <w:rPr>
+          <w:color w:val="C4421D"/>
+        </w:rPr>
+        <w:t>#B3CFF2</w:t>
+      </w:r>
+      <w:r>
+        <w:t xml:space="preserve">; vermilion arm </w:t>
+      </w:r>
+      <w:r>
+        <w:rPr>
+          <w:color w:val="C4421D"/>
+        </w:rPr>
+        <w:t>#F6C3B1</w:t>
+      </w:r>
+      <w:r>
+        <w:t xml:space="preserve"> </w:t>
+      </w:r>
+      <w:r>
+        <w:rPr>
+          <w:color w:val="C4421D"/>
+        </w:rPr>
+        <w:t>#F0A084</w:t>
+      </w:r>
+      <w:r>
+        <w:t xml:space="preserve"> </w:t>
+      </w:r>
+      <w:r>
+        <w:rPr>
+          <w:color w:val="C4421D"/>
+        </w:rPr>
+        <w:t>#E4572E</w:t>
+      </w:r>
+      <w:r>
+        <w:t xml:space="preserve"> </w:t>
+      </w:r>
+      <w:r>
+        <w:rPr>
+          <w:color w:val="C4421D"/>
+        </w:rPr>
+        <w:t>#C4421D</w:t>
+      </w:r>
+      <w:r>
+        <w:t>. The midpoint is always grey.</w:t>
+      </w:r>
+    </w:p>
+    <w:p>
+      <w:pPr>
+        <w:pStyle w:val="Heading2"/>
+      </w:pPr>
+      <w:r>
+        <w:t>Chart anatomy</w:t>
+      </w:r>
+    </w:p>
+    <w:p>
+      <w:pPr>
+        <w:pStyle w:val="ListBullet"/>
+      </w:pPr>
+      <w:r>
+        <w:t>One y-axis only; never two scales on one chart.</w:t>
+      </w:r>
+    </w:p>
+    <w:p>
+      <w:pPr>
+        <w:pStyle w:val="ListBullet"/>
+      </w:pPr>
+      <w:r>
+        <w:t xml:space="preserve">Gridlines hairline </w:t>
+      </w:r>
+      <w:r>
+        <w:rPr>
+          <w:color w:val="C4421D"/>
+        </w:rPr>
+        <w:t>#E3E3E3</w:t>
+      </w:r>
+      <w:r>
+        <w:t xml:space="preserve">, axis line </w:t>
+      </w:r>
+      <w:r>
+        <w:rPr>
+          <w:color w:val="C4421D"/>
+        </w:rPr>
+        <w:t>#BDBDBD</w:t>
+      </w:r>
+      <w:r>
+        <w:t xml:space="preserve">, labels Nunito Sans 11 pt in </w:t>
+      </w:r>
+      <w:r>
+        <w:rPr>
+          <w:color w:val="C4421D"/>
+        </w:rPr>
+        <w:t>muted</w:t>
+      </w:r>
+      <w:r>
+        <w:t>.</w:t>
+      </w:r>
+    </w:p>
+    <w:p>
+      <w:pPr>
+        <w:pStyle w:val="ListBullet"/>
+      </w:pPr>
+      <w:r>
+        <w:t>Chart title = the takeaway, in Jost Bold; source line in caption style.</w:t>
+      </w:r>
+    </w:p>
+    <w:p>
+      <w:pPr>
+        <w:pStyle w:val="ListBullet"/>
+      </w:pPr>
+      <w:r>
+        <w:t>Values and labels are set in ink/muted text colours, not in the series colour.</w:t>
+      </w:r>
+    </w:p>
+    <w:p>
+      <w:pPr>
+        <w:pStyle w:val="ListBullet"/>
+      </w:pPr>
+      <w:r>
+        <w:t>Legend whenever there are 2+ series; with 4 or fewer, also label the lines directly.</w:t>
+      </w:r>
+    </w:p>
+    <w:p>
+      <w:pPr>
+        <w:pStyle w:val="ListBullet"/>
+      </w:pPr>
+      <w:r>
+        <w:t xml:space="preserve">Status colours (good / warning / critical) are </w:t>
+      </w:r>
+      <w:r>
+        <w:rPr>
+          <w:i/>
+        </w:rPr>
+        <w:t>not</w:t>
+      </w:r>
+      <w:r>
+        <w:t xml:space="preserve"> series colours; if you need them, pair them with an icon and a word.</w:t>
+      </w:r>
+    </w:p>
+    <w:p>
+      <w:pPr>
+        <w:pStyle w:val="Heading2"/>
+      </w:pPr>
+      <w:r>
+        <w:t>Diagrams</w:t>
+      </w:r>
+    </w:p>
+    <w:p>
+      <w:pPr>
+        <w:pStyle w:val="ListBullet"/>
+      </w:pPr>
+      <w:r>
+        <w:t xml:space="preserve">Flat shapes, 1 px strokes in </w:t>
+      </w:r>
+      <w:r>
+        <w:rPr>
+          <w:color w:val="C4421D"/>
+        </w:rPr>
+        <w:t>ink</w:t>
+      </w:r>
+      <w:r>
+        <w:t>, labels in Nunito Sans, titles in Jost.</w:t>
+      </w:r>
+    </w:p>
+    <w:p>
+      <w:pPr>
+        <w:pStyle w:val="ListBullet"/>
+      </w:pPr>
+      <w:r>
+        <w:t xml:space="preserve">Fill: </w:t>
+      </w:r>
+      <w:r>
+        <w:rPr>
+          <w:color w:val="C4421D"/>
+        </w:rPr>
+        <w:t>paper</w:t>
+      </w:r>
+      <w:r>
+        <w:t xml:space="preserve"> (white) by default; the one element that matters in </w:t>
+      </w:r>
+      <w:r>
+        <w:rPr>
+          <w:color w:val="C4421D"/>
+        </w:rPr>
+        <w:t>accent</w:t>
+      </w:r>
+      <w:r>
+        <w:t xml:space="preserve"> with white bold text (≥ 14 pt).</w:t>
+      </w:r>
+    </w:p>
+    <w:p>
+      <w:pPr>
+        <w:pStyle w:val="ListBullet"/>
+      </w:pPr>
+      <w:r>
+        <w:t>Grouping: a light grey panel (</w:t>
+      </w:r>
+      <w:r>
+        <w:rPr>
+          <w:color w:val="C4421D"/>
+        </w:rPr>
+        <w:t>#F4F4F4</w:t>
+      </w:r>
+      <w:r>
+        <w:t>), not coloured borders.</w:t>
+      </w:r>
+    </w:p>
+    <w:p>
+      <w:pPr>
+        <w:pStyle w:val="ListBullet"/>
+      </w:pPr>
+      <w:r>
+        <w:t>If a diagram needs categories, use series slots 2 and 3 (blue, aqua) — keep vermilion for the highlight.</w:t>
+      </w:r>
+    </w:p>
+    <w:p>
+      <w:pPr>
+        <w:pStyle w:val="Heading1"/>
+      </w:pPr>
+      <w:r>
+        <w:t>4. Layout principles (starting set)</w:t>
       </w:r>
     </w:p>
     <w:p>
@@ -2076,7 +3135,7 @@
         <w:pStyle w:val="Heading1"/>
       </w:pPr>
       <w:r>
-        <w:t>4. Setting it up in Google Workspace</w:t>
+        <w:t>5. Setting it up in Google Workspace</w:t>
       </w:r>
     </w:p>
     <w:p>
@@ -2334,7 +3393,7 @@
         <w:pStyle w:val="Heading1"/>
       </w:pPr>
       <w:r>
-        <w:t>5. Templates</w:t>
+        <w:t>6. Templates</w:t>
       </w:r>
     </w:p>
     <w:tbl>
@@ -2565,7 +3624,7 @@
         <w:pStyle w:val="Heading1"/>
       </w:pPr>
       <w:r>
-        <w:t>6. Licensing note</w:t>
+        <w:t>7. Licensing note</w:t>
       </w:r>
     </w:p>
     <w:p>
@@ -2579,6 +3638,20 @@
       </w:pPr>
       <w:r>
         <w:t>Changelog</w:t>
+      </w:r>
+    </w:p>
+    <w:p>
+      <w:pPr>
+        <w:pStyle w:val="ListBullet"/>
+      </w:pPr>
+      <w:r>
+        <w:rPr>
+          <w:b/>
+        </w:rPr>
+        <w:t>v0.3</w:t>
+      </w:r>
+      <w:r>
+        <w:t xml:space="preserve"> — Chart &amp; diagram colours (validated for colour-blind readers), chart anatomy rules.</w:t>
       </w:r>
     </w:p>
     <w:p>

</xml_diff>

<commit_message>
Add XLRTE logo, X monogram and P·E personal mark (v0.4)
XLRTE wordmark in Jost Medium outlines at 6 % spacing, with the X's left
half as a vermilion forward chevron. X monogram doubles as favicon/app
icon. P·E mark overlaps the initials; only the shared area is vermilion.
Adds the Logo section to the guide and puts the logo on the templates.
build_logo.py regenerates every file from tokens.json.

Co-Authored-By: Claude Opus 5.5 <noreply@anthropic.com>
Claude-Session: https://claude.ai/code/session_01XqgwAyFKTF32FKpGUD9hrF
</commit_message>
<xml_diff>
--- a/brand/templates/brand-docs-template.docx
+++ b/brand/templates/brand-docs-template.docx
@@ -4,10 +4,49 @@
   <w:body>
     <w:p>
       <w:pPr>
+        <w:spacing w:after="360"/>
+      </w:pPr>
+      <w:r>
+        <w:drawing>
+          <wp:inline xmlns:a="http://schemas.openxmlformats.org/drawingml/2006/main" xmlns:pic="http://schemas.openxmlformats.org/drawingml/2006/picture">
+            <wp:extent cx="1384290" cy="324000"/>
+            <wp:docPr id="1" name="Picture 1"/>
+            <wp:cNvGraphicFramePr>
+              <a:graphicFrameLocks noChangeAspect="1"/>
+            </wp:cNvGraphicFramePr>
+            <a:graphic>
+              <a:graphicData uri="http://schemas.openxmlformats.org/drawingml/2006/picture">
+                <pic:pic>
+                  <pic:nvPicPr>
+                    <pic:cNvPr id="0" name="xlrte-color.png"/>
+                    <pic:cNvPicPr/>
+                  </pic:nvPicPr>
+                  <pic:blipFill>
+                    <a:blip r:embed="rId9"/>
+                    <a:stretch>
+                      <a:fillRect/>
+                    </a:stretch>
+                  </pic:blipFill>
+                  <pic:spPr>
+                    <a:xfrm>
+                      <a:off x="0" y="0"/>
+                      <a:ext cx="1384290" cy="324000"/>
+                    </a:xfrm>
+                    <a:prstGeom prst="rect"/>
+                  </pic:spPr>
+                </pic:pic>
+              </a:graphicData>
+            </a:graphic>
+          </wp:inline>
+        </w:drawing>
+      </w:r>
+    </w:p>
+    <w:p>
+      <w:pPr>
         <w:pStyle w:val="Title"/>
       </w:pPr>
       <w:r>
-        <w:t>Brand Style Guide — v0.3 (draft)</w:t>
+        <w:t>Brand Style Guide — v0.4 (draft)</w:t>
       </w:r>
     </w:p>
     <w:p>
@@ -41,7 +80,515 @@
         <w:pStyle w:val="Heading1"/>
       </w:pPr>
       <w:r>
-        <w:t>1. Typography</w:t>
+        <w:t>1. Logo</w:t>
+      </w:r>
+    </w:p>
+    <w:p>
+      <w:pPr>
+        <w:pStyle w:val="Heading2"/>
+      </w:pPr>
+      <w:r>
+        <w:t>XLRTE (company brand)</w:t>
+      </w:r>
+    </w:p>
+    <w:p>
+      <w:r>
+        <w:rPr>
+          <w:b/>
+        </w:rPr>
+        <w:t>XLRTE</w:t>
+      </w:r>
+      <w:r>
+        <w:t xml:space="preserve"> reads as </w:t>
+      </w:r>
+      <w:r>
+        <w:rPr>
+          <w:i/>
+        </w:rPr>
+        <w:t>accelerate</w:t>
+      </w:r>
+      <w:r>
+        <w:t>. The wordmark is set in Jost Medium with 6 % letter spacing, converted to outlines. The left half of the X is a forward chevron in vermilion, split from the rest by a hairline gap: an arrow hidden in the first letter, pointing into the name. Everything else stays in ink. Understatement is the point: one accent, no decoration.</w:t>
+      </w:r>
+    </w:p>
+    <w:tbl>
+      <w:tblPr>
+        <w:tblStyle w:val="TableGrid"/>
+        <w:tblW w:type="auto" w:w="0"/>
+        <w:jc w:val="left"/>
+        <w:tblLook w:firstColumn="1" w:firstRow="1" w:lastColumn="0" w:lastRow="0" w:noHBand="0" w:noVBand="1" w:val="04A0"/>
+      </w:tblPr>
+      <w:tblGrid>
+        <w:gridCol w:w="4706"/>
+        <w:gridCol w:w="4706"/>
+      </w:tblGrid>
+      <w:tr>
+        <w:tc>
+          <w:tcPr>
+            <w:tcW w:type="dxa" w:w="4706"/>
+            <w:shd w:val="clear" w:color="auto" w:fill="F4F4F4"/>
+          </w:tcPr>
+          <w:p>
+            <w:pPr>
+              <w:spacing w:after="0"/>
+            </w:pPr>
+            <w:r>
+              <w:rPr>
+                <w:b/>
+                <w:sz w:val="19"/>
+              </w:rPr>
+              <w:t>File</w:t>
+            </w:r>
+          </w:p>
+        </w:tc>
+        <w:tc>
+          <w:tcPr>
+            <w:tcW w:type="dxa" w:w="4706"/>
+            <w:shd w:val="clear" w:color="auto" w:fill="F4F4F4"/>
+          </w:tcPr>
+          <w:p>
+            <w:pPr>
+              <w:spacing w:after="0"/>
+            </w:pPr>
+            <w:r>
+              <w:rPr>
+                <w:b/>
+                <w:sz w:val="19"/>
+              </w:rPr>
+              <w:t>Use</w:t>
+            </w:r>
+          </w:p>
+        </w:tc>
+      </w:tr>
+      <w:tr>
+        <w:tc>
+          <w:tcPr>
+            <w:tcW w:type="dxa" w:w="4706"/>
+          </w:tcPr>
+          <w:p>
+            <w:pPr>
+              <w:spacing w:after="0"/>
+            </w:pPr>
+            <w:r>
+              <w:rPr>
+                <w:color w:val="C4421D"/>
+                <w:sz w:val="19"/>
+              </w:rPr>
+              <w:t>logo/xlrte-color.svg</w:t>
+            </w:r>
+          </w:p>
+        </w:tc>
+        <w:tc>
+          <w:tcPr>
+            <w:tcW w:type="dxa" w:w="4706"/>
+          </w:tcPr>
+          <w:p>
+            <w:pPr>
+              <w:spacing w:after="0"/>
+            </w:pPr>
+            <w:r>
+              <w:rPr>
+                <w:sz w:val="19"/>
+              </w:rPr>
+              <w:t>Default, on white or light backgrounds</w:t>
+            </w:r>
+          </w:p>
+        </w:tc>
+      </w:tr>
+      <w:tr>
+        <w:tc>
+          <w:tcPr>
+            <w:tcW w:type="dxa" w:w="4706"/>
+          </w:tcPr>
+          <w:p>
+            <w:pPr>
+              <w:spacing w:after="0"/>
+            </w:pPr>
+            <w:r>
+              <w:rPr>
+                <w:color w:val="C4421D"/>
+                <w:sz w:val="19"/>
+              </w:rPr>
+              <w:t>logo/xlrte-white.svg</w:t>
+            </w:r>
+          </w:p>
+        </w:tc>
+        <w:tc>
+          <w:tcPr>
+            <w:tcW w:type="dxa" w:w="4706"/>
+          </w:tcPr>
+          <w:p>
+            <w:pPr>
+              <w:spacing w:after="0"/>
+            </w:pPr>
+            <w:r>
+              <w:rPr>
+                <w:sz w:val="19"/>
+              </w:rPr>
+              <w:t>On ink, dark photos, the dark title slide</w:t>
+            </w:r>
+          </w:p>
+        </w:tc>
+      </w:tr>
+      <w:tr>
+        <w:tc>
+          <w:tcPr>
+            <w:tcW w:type="dxa" w:w="4706"/>
+          </w:tcPr>
+          <w:p>
+            <w:pPr>
+              <w:spacing w:after="0"/>
+            </w:pPr>
+            <w:r>
+              <w:rPr>
+                <w:color w:val="C4421D"/>
+                <w:sz w:val="19"/>
+              </w:rPr>
+              <w:t>logo/xlrte-black.svg</w:t>
+            </w:r>
+          </w:p>
+        </w:tc>
+        <w:tc>
+          <w:tcPr>
+            <w:tcW w:type="dxa" w:w="4706"/>
+          </w:tcPr>
+          <w:p>
+            <w:pPr>
+              <w:spacing w:after="0"/>
+            </w:pPr>
+            <w:r>
+              <w:rPr>
+                <w:sz w:val="19"/>
+              </w:rPr>
+              <w:t>Single colour: print, stamps, fax, embossing</w:t>
+            </w:r>
+          </w:p>
+        </w:tc>
+      </w:tr>
+      <w:tr>
+        <w:tc>
+          <w:tcPr>
+            <w:tcW w:type="dxa" w:w="4706"/>
+          </w:tcPr>
+          <w:p>
+            <w:pPr>
+              <w:spacing w:after="0"/>
+            </w:pPr>
+            <w:r>
+              <w:rPr>
+                <w:color w:val="C4421D"/>
+                <w:sz w:val="19"/>
+              </w:rPr>
+              <w:t>logo/xlrte-mono-white.svg</w:t>
+            </w:r>
+          </w:p>
+        </w:tc>
+        <w:tc>
+          <w:tcPr>
+            <w:tcW w:type="dxa" w:w="4706"/>
+          </w:tcPr>
+          <w:p>
+            <w:pPr>
+              <w:spacing w:after="0"/>
+            </w:pPr>
+            <w:r>
+              <w:rPr>
+                <w:sz w:val="19"/>
+              </w:rPr>
+              <w:t>Single colour on vermilion or busy backgrounds</w:t>
+            </w:r>
+          </w:p>
+        </w:tc>
+      </w:tr>
+      <w:tr>
+        <w:tc>
+          <w:tcPr>
+            <w:tcW w:type="dxa" w:w="4706"/>
+          </w:tcPr>
+          <w:p>
+            <w:pPr>
+              <w:spacing w:after="0"/>
+            </w:pPr>
+            <w:r>
+              <w:rPr>
+                <w:color w:val="C4421D"/>
+                <w:sz w:val="19"/>
+              </w:rPr>
+              <w:t>logo/x-monogram.svg</w:t>
+            </w:r>
+            <w:r>
+              <w:rPr>
+                <w:sz w:val="19"/>
+              </w:rPr>
+              <w:t xml:space="preserve">, </w:t>
+            </w:r>
+            <w:r>
+              <w:rPr>
+                <w:color w:val="C4421D"/>
+                <w:sz w:val="19"/>
+              </w:rPr>
+              <w:t>favicon.ico</w:t>
+            </w:r>
+            <w:r>
+              <w:rPr>
+                <w:sz w:val="19"/>
+              </w:rPr>
+              <w:t xml:space="preserve">, </w:t>
+            </w:r>
+            <w:r>
+              <w:rPr>
+                <w:color w:val="C4421D"/>
+                <w:sz w:val="19"/>
+              </w:rPr>
+              <w:t>favicon-16/32.png</w:t>
+            </w:r>
+            <w:r>
+              <w:rPr>
+                <w:sz w:val="19"/>
+              </w:rPr>
+              <w:t xml:space="preserve">, </w:t>
+            </w:r>
+            <w:r>
+              <w:rPr>
+                <w:color w:val="C4421D"/>
+                <w:sz w:val="19"/>
+              </w:rPr>
+              <w:t>apple-touch-icon.png</w:t>
+            </w:r>
+          </w:p>
+        </w:tc>
+        <w:tc>
+          <w:tcPr>
+            <w:tcW w:type="dxa" w:w="4706"/>
+          </w:tcPr>
+          <w:p>
+            <w:pPr>
+              <w:spacing w:after="0"/>
+            </w:pPr>
+            <w:r>
+              <w:rPr>
+                <w:sz w:val="19"/>
+              </w:rPr>
+              <w:t>Favicons, app icons, social avatars</w:t>
+            </w:r>
+          </w:p>
+        </w:tc>
+      </w:tr>
+    </w:tbl>
+    <w:p/>
+    <w:p>
+      <w:r>
+        <w:t>PNG versions sit next to each SVG. Use the SVG wherever possible.</w:t>
+      </w:r>
+    </w:p>
+    <w:p>
+      <w:pPr>
+        <w:pStyle w:val="Heading2"/>
+      </w:pPr>
+      <w:r>
+        <w:t>P·E (personal mark)</w:t>
+      </w:r>
+    </w:p>
+    <w:p>
+      <w:r>
+        <w:t xml:space="preserve">Your initials, </w:t>
+      </w:r>
+      <w:r>
+        <w:rPr>
+          <w:b/>
+        </w:rPr>
+        <w:t>P</w:t>
+      </w:r>
+      <w:r>
+        <w:t xml:space="preserve"> (human: round, open) and </w:t>
+      </w:r>
+      <w:r>
+        <w:rPr>
+          <w:b/>
+        </w:rPr>
+        <w:t>E</w:t>
+      </w:r>
+      <w:r>
+        <w:t xml:space="preserve"> (machine: straight, modular), overlap slightly. Both letters are ink. Only the area they share is vermilion: the spark of human–machine interaction. Use it for your signature, profile and author line. XLRTE remains the company brand.</w:t>
+      </w:r>
+    </w:p>
+    <w:p>
+      <w:r>
+        <w:t xml:space="preserve">Files: </w:t>
+      </w:r>
+      <w:r>
+        <w:rPr>
+          <w:color w:val="C4421D"/>
+        </w:rPr>
+        <w:t>logo/pe-color.svg</w:t>
+      </w:r>
+      <w:r>
+        <w:t xml:space="preserve">, </w:t>
+      </w:r>
+      <w:r>
+        <w:rPr>
+          <w:color w:val="C4421D"/>
+        </w:rPr>
+        <w:t>pe-white.svg</w:t>
+      </w:r>
+      <w:r>
+        <w:t xml:space="preserve">, </w:t>
+      </w:r>
+      <w:r>
+        <w:rPr>
+          <w:color w:val="C4421D"/>
+        </w:rPr>
+        <w:t>pe-black.svg</w:t>
+      </w:r>
+      <w:r>
+        <w:t xml:space="preserve">, </w:t>
+      </w:r>
+      <w:r>
+        <w:rPr>
+          <w:color w:val="C4421D"/>
+        </w:rPr>
+        <w:t>pe-mono-white.svg</w:t>
+      </w:r>
+      <w:r>
+        <w:t>. In the single-colour versions the spark becomes a cut-out.</w:t>
+      </w:r>
+    </w:p>
+    <w:p>
+      <w:pPr>
+        <w:pStyle w:val="Heading2"/>
+      </w:pPr>
+      <w:r>
+        <w:t>Rules</w:t>
+      </w:r>
+    </w:p>
+    <w:p>
+      <w:pPr>
+        <w:pStyle w:val="ListBullet"/>
+      </w:pPr>
+      <w:r>
+        <w:rPr>
+          <w:b/>
+        </w:rPr>
+        <w:t>Clear space:</w:t>
+      </w:r>
+      <w:r>
+        <w:t xml:space="preserve"> keep free space of at least </w:t>
+      </w:r>
+      <w:r>
+        <w:rPr>
+          <w:b/>
+        </w:rPr>
+        <w:t>half the letter height</w:t>
+      </w:r>
+      <w:r>
+        <w:t xml:space="preserve"> on all sides. Nothing else may enter it.</w:t>
+      </w:r>
+    </w:p>
+    <w:p>
+      <w:pPr>
+        <w:pStyle w:val="ListBullet"/>
+      </w:pPr>
+      <w:r>
+        <w:rPr>
+          <w:b/>
+        </w:rPr>
+        <w:t>Minimum size:</w:t>
+      </w:r>
+      <w:r>
+        <w:t xml:space="preserve"> letter height 16 px on screen (wordmark about 90 px wide), 6 mm in print. Below that, use the X monogram.</w:t>
+      </w:r>
+    </w:p>
+    <w:p>
+      <w:pPr>
+        <w:pStyle w:val="ListBullet"/>
+      </w:pPr>
+      <w:r>
+        <w:rPr>
+          <w:b/>
+        </w:rPr>
+        <w:t>Together:</w:t>
+      </w:r>
+      <w:r>
+        <w:t xml:space="preserve"> XLRTE first, P·E after it, separated by a thin </w:t>
+      </w:r>
+      <w:r>
+        <w:rPr>
+          <w:color w:val="C4421D"/>
+        </w:rPr>
+        <w:t>line</w:t>
+      </w:r>
+      <w:r>
+        <w:t xml:space="preserve"> rule and with both at the same letter height.</w:t>
+      </w:r>
+    </w:p>
+    <w:p>
+      <w:pPr>
+        <w:pStyle w:val="ListBullet"/>
+      </w:pPr>
+      <w:r>
+        <w:rPr>
+          <w:b/>
+        </w:rPr>
+        <w:t>Backgrounds:</w:t>
+      </w:r>
+      <w:r>
+        <w:t xml:space="preserve"> white or ink. On vermilion, use the single-colour versions. On photos, use white, and only where the image is calm.</w:t>
+      </w:r>
+    </w:p>
+    <w:p>
+      <w:pPr>
+        <w:pStyle w:val="Heading3"/>
+      </w:pPr>
+      <w:r>
+        <w:t>Don't</w:t>
+      </w:r>
+    </w:p>
+    <w:p>
+      <w:pPr>
+        <w:pStyle w:val="ListBullet"/>
+      </w:pPr>
+      <w:r>
+        <w:t>recolour the chevron or the spark, or add a second accent colour</w:t>
+      </w:r>
+    </w:p>
+    <w:p>
+      <w:pPr>
+        <w:pStyle w:val="ListBullet"/>
+      </w:pPr>
+      <w:r>
+        <w:t>set XLRTE in live text: always use the logo files</w:t>
+      </w:r>
+    </w:p>
+    <w:p>
+      <w:pPr>
+        <w:pStyle w:val="ListBullet"/>
+      </w:pPr>
+      <w:r>
+        <w:t>change the letter spacing, stretch, rotate, outline or add shadows</w:t>
+      </w:r>
+    </w:p>
+    <w:p>
+      <w:pPr>
+        <w:pStyle w:val="ListBullet"/>
+      </w:pPr>
+      <w:r>
+        <w:t>place the colour logo on vermilion (the chevron disappears)</w:t>
+      </w:r>
+    </w:p>
+    <w:p>
+      <w:pPr>
+        <w:pStyle w:val="ListBullet"/>
+      </w:pPr>
+      <w:r>
+        <w:t>combine XLRTE and P·E into one mark</w:t>
+      </w:r>
+    </w:p>
+    <w:p>
+      <w:pPr>
+        <w:pStyle w:val="Heading1"/>
+      </w:pPr>
+      <w:r>
+        <w:t>2. Typography</w:t>
       </w:r>
     </w:p>
     <w:p>
@@ -1544,7 +2091,7 @@
         <w:pStyle w:val="Heading1"/>
       </w:pPr>
       <w:r>
-        <w:t>2. Colour</w:t>
+        <w:t>3. Colour</w:t>
       </w:r>
     </w:p>
     <w:p>
@@ -2004,7 +2551,7 @@
         <w:pStyle w:val="Heading1"/>
       </w:pPr>
       <w:r>
-        <w:t>3. Charts &amp; diagrams</w:t>
+        <w:t>4. Charts &amp; diagrams</w:t>
       </w:r>
     </w:p>
     <w:p>
@@ -3063,7 +3610,7 @@
         <w:pStyle w:val="Heading1"/>
       </w:pPr>
       <w:r>
-        <w:t>4. Layout principles (starting set)</w:t>
+        <w:t>5. Layout principles (starting set)</w:t>
       </w:r>
     </w:p>
     <w:p>
@@ -3135,7 +3682,7 @@
         <w:pStyle w:val="Heading1"/>
       </w:pPr>
       <w:r>
-        <w:t>5. Setting it up in Google Workspace</w:t>
+        <w:t>6. Setting it up in Google Workspace</w:t>
       </w:r>
     </w:p>
     <w:p>
@@ -3393,7 +3940,7 @@
         <w:pStyle w:val="Heading1"/>
       </w:pPr>
       <w:r>
-        <w:t>6. Templates</w:t>
+        <w:t>7. Templates</w:t>
       </w:r>
     </w:p>
     <w:tbl>
@@ -3624,7 +4171,7 @@
         <w:pStyle w:val="Heading1"/>
       </w:pPr>
       <w:r>
-        <w:t>7. Licensing note</w:t>
+        <w:t>8. Licensing note</w:t>
       </w:r>
     </w:p>
     <w:p>
@@ -3638,6 +4185,20 @@
       </w:pPr>
       <w:r>
         <w:t>Changelog</w:t>
+      </w:r>
+    </w:p>
+    <w:p>
+      <w:pPr>
+        <w:pStyle w:val="ListBullet"/>
+      </w:pPr>
+      <w:r>
+        <w:rPr>
+          <w:b/>
+        </w:rPr>
+        <w:t>v0.4</w:t>
+      </w:r>
+      <w:r>
+        <w:t xml:space="preserve"> — Logo: XLRTE wordmark with forward chevron, X monogram and favicons, P·E personal mark.</w:t>
       </w:r>
     </w:p>
     <w:p>

</xml_diff>

<commit_message>
Style guide: logo step in the Google Slides setup
Co-Authored-By: Claude Opus 5.5 <noreply@anthropic.com>
Claude-Session: https://claude.ai/code/session_01XqgwAyFKTF32FKpGUD9hrF
</commit_message>
<xml_diff>
--- a/brand/templates/brand-docs-template.docx
+++ b/brand/templates/brand-docs-template.docx
@@ -3816,7 +3816,18 @@
       <w:r>
         <w:t>5.</w:t>
         <w:tab/>
-        <w:t xml:space="preserve">Rename the theme (e.g. "Brand v0.2"), save the file as </w:t>
+        <w:t>Insert the logo PNGs on the layouts (white wordmark on dark layouts, colour wordmark in the footer of light ones).</w:t>
+      </w:r>
+    </w:p>
+    <w:p>
+      <w:pPr>
+        <w:spacing w:after="60"/>
+        <w:ind w:left="340" w:hanging="340"/>
+      </w:pPr>
+      <w:r>
+        <w:t>6.</w:t>
+        <w:tab/>
+        <w:t xml:space="preserve">Rename the theme (e.g. "XLRTE v0.4"), save the file as </w:t>
       </w:r>
       <w:r>
         <w:rPr>

</xml_diff>